<commit_message>
Actualizar Capítulo 5 - Prototipado y validación
</commit_message>
<xml_diff>
--- a/FASE 1 - ANALISIS/CAPITULO 5 - PROTOTIPADO Y VALIDACION/Capitulo 5 - Prototipado y validacion de analisis.docx
+++ b/FASE 1 - ANALISIS/CAPITULO 5 - PROTOTIPADO Y VALIDACION/Capitulo 5 - Prototipado y validacion de analisis.docx
@@ -607,6 +607,7 @@
       <w:r>
         <w:rPr>
           <w:rFonts w:ascii="Arial Black" w:hAnsi="Arial Black"/>
+          <w:noProof/>
           <w:sz w:val="20"/>
           <w:szCs w:val="20"/>
         </w:rPr>
@@ -811,19 +812,7 @@
           <w:rPr>
             <w:rStyle w:val="Hipervnculo"/>
           </w:rPr>
-          <w:t>https://www.figma.co</w:t>
-        </w:r>
-        <w:r>
-          <w:rPr>
-            <w:rStyle w:val="Hipervnculo"/>
-          </w:rPr>
-          <w:t>m</w:t>
-        </w:r>
-        <w:r>
-          <w:rPr>
-            <w:rStyle w:val="Hipervnculo"/>
-          </w:rPr>
-          <w:t>/design/HGHcq0fLpWcmXIheBDwMd5/Prototipo-inicio-sesion?node-id=0-1&amp;t=OBjoVaWx3OBJR4kH-1</w:t>
+          <w:t>https://www.figma.com/design/HGHcq0fLpWcmXIheBDwMd5/Prototipo-inicio-sesion?node-id=0-1&amp;t=OBjoVaWx3OBJR4kH-1</w:t>
         </w:r>
       </w:hyperlink>
     </w:p>
@@ -1985,6 +1974,9 @@
         <w:jc w:val="both"/>
       </w:pPr>
       <w:r>
+        <w:rPr>
+          <w:noProof/>
+        </w:rPr>
         <w:drawing>
           <wp:anchor distT="0" distB="0" distL="114300" distR="114300" simplePos="0" relativeHeight="251661312" behindDoc="1" locked="0" layoutInCell="1" allowOverlap="1" wp14:anchorId="4A4A3ED6" wp14:editId="65D13F28">
             <wp:simplePos x="0" y="0"/>
@@ -3081,6 +3073,9 @@
         </w:rPr>
       </w:pPr>
       <w:r>
+        <w:rPr>
+          <w:noProof/>
+        </w:rPr>
         <w:lastRenderedPageBreak/>
         <w:drawing>
           <wp:anchor distT="0" distB="0" distL="114300" distR="114300" simplePos="0" relativeHeight="251662336" behindDoc="1" locked="0" layoutInCell="1" allowOverlap="1" wp14:anchorId="7E38E3B3" wp14:editId="0303C10C">
@@ -3312,14 +3307,27 @@
         <w:t>YENJO 1.0</w:t>
       </w:r>
       <w:r>
-        <w:t xml:space="preserve"> establece esta relación para los dieciséis requisitos funcionales identificados, desde </w:t>
-      </w:r>
-      <w:r>
-        <w:rPr>
-          <w:b/>
-          <w:bCs/>
-        </w:rPr>
-        <w:t>RF-001 hasta RF-016</w:t>
+        <w:t xml:space="preserve"> establece esta relación para los dieci</w:t>
+      </w:r>
+      <w:r>
+        <w:t>siete</w:t>
+      </w:r>
+      <w:r>
+        <w:t xml:space="preserve"> requisitos funcionales identificados, desde </w:t>
+      </w:r>
+      <w:r>
+        <w:rPr>
+          <w:b/>
+          <w:bCs/>
+        </w:rPr>
+        <w:t>RF-001 hasta RF-01</w:t>
+      </w:r>
+      <w:r>
+        <w:rPr>
+          <w:b/>
+          <w:bCs/>
+        </w:rPr>
+        <w:t>7</w:t>
       </w:r>
       <w:r>
         <w:t xml:space="preserve">. </w:t>
@@ -3708,6 +3716,9 @@
         </w:rPr>
       </w:pPr>
       <w:r>
+        <w:rPr>
+          <w:noProof/>
+        </w:rPr>
         <w:drawing>
           <wp:anchor distT="0" distB="0" distL="114300" distR="114300" simplePos="0" relativeHeight="251663360" behindDoc="1" locked="0" layoutInCell="1" allowOverlap="1" wp14:anchorId="34D5B1CD" wp14:editId="31B6791D">
             <wp:simplePos x="0" y="0"/>
@@ -4798,6 +4809,9 @@
         </w:rPr>
       </w:pPr>
       <w:r>
+        <w:rPr>
+          <w:noProof/>
+        </w:rPr>
         <w:drawing>
           <wp:anchor distT="0" distB="0" distL="114300" distR="114300" simplePos="0" relativeHeight="251664384" behindDoc="1" locked="0" layoutInCell="1" allowOverlap="1" wp14:anchorId="4D23FFB1" wp14:editId="663C2B33">
             <wp:simplePos x="0" y="0"/>
@@ -5257,7 +5271,19 @@
         <w:rPr>
           <w:rFonts w:cstheme="minorHAnsi"/>
         </w:rPr>
-        <w:t xml:space="preserve">permitió identificar diferentes aspectos susceptibles de ajuste en los prototipos, las interfaces y la organización de la solución. Estos cambios </w:t>
+        <w:t>permiti</w:t>
+      </w:r>
+      <w:r>
+        <w:rPr>
+          <w:rFonts w:cstheme="minorHAnsi"/>
+        </w:rPr>
+        <w:t>do</w:t>
+      </w:r>
+      <w:r>
+        <w:rPr>
+          <w:rFonts w:cstheme="minorHAnsi"/>
+        </w:rPr>
+        <w:t xml:space="preserve"> identificar diferentes aspectos susceptibles de ajuste en los prototipos, las interfaces y la organización de la solución. Estos cambios </w:t>
       </w:r>
       <w:r>
         <w:rPr>
@@ -6465,6 +6491,7 @@
         <w:docPartUnique/>
       </w:docPartObj>
     </w:sdtPr>
+    <w:sdtEndPr/>
     <w:sdtContent>
       <w:p>
         <w:pPr>
@@ -6548,7 +6575,7 @@
         <v:path o:extrusionok="f" gradientshapeok="t" o:connecttype="rect"/>
         <o:lock v:ext="edit" aspectratio="t"/>
       </v:shapetype>
-      <v:shape id="_x0000_i2345" type="#_x0000_t75" style="width:11.25pt;height:11.25pt" o:bullet="t">
+      <v:shape id="_x0000_i5232" type="#_x0000_t75" style="width:11.25pt;height:11.25pt" o:bullet="t">
         <v:imagedata r:id="rId1" o:title="mso6FA9"/>
       </v:shape>
     </w:pict>
@@ -9485,6 +9512,7 @@
   <w:style w:type="character" w:default="1" w:styleId="Fuentedeprrafopredeter">
     <w:name w:val="Default Paragraph Font"/>
     <w:uiPriority w:val="1"/>
+    <w:semiHidden/>
     <w:unhideWhenUsed/>
   </w:style>
   <w:style w:type="table" w:default="1" w:styleId="Tablanormal">

</xml_diff>